<commit_message>
Further refactoring towards Model-View-Controller, added AppLauncher
In the AppLauncher you can chose the database to use.
</commit_message>
<xml_diff>
--- a/Resources/SmartTimingLogo_Drafts.docx
+++ b/Resources/SmartTimingLogo_Drafts.docx
@@ -5,7 +5,6 @@
     <w:p>
       <w:pPr>
         <w:spacing w:after="0" w:line="1000" w:lineRule="exact"/>
-        <w:jc w:val="center"/>
         <w:rPr>
           <w:rFonts w:ascii="Good Timing Rg" w:hAnsi="Good Timing Rg"/>
           <w:b/>
@@ -26,6 +25,180 @@
       </w:pPr>
       <w:r>
         <w:rPr>
+          <w:noProof/>
+        </w:rPr>
+        <mc:AlternateContent>
+          <mc:Choice Requires="wps">
+            <w:drawing>
+              <wp:anchor distT="45720" distB="45720" distL="114300" distR="114300" simplePos="0" relativeHeight="251668480" behindDoc="0" locked="0" layoutInCell="1" allowOverlap="1">
+                <wp:simplePos x="0" y="0"/>
+                <wp:positionH relativeFrom="margin">
+                  <wp:posOffset>1607085</wp:posOffset>
+                </wp:positionH>
+                <wp:positionV relativeFrom="paragraph">
+                  <wp:posOffset>14441</wp:posOffset>
+                </wp:positionV>
+                <wp:extent cx="3616325" cy="1283970"/>
+                <wp:effectExtent l="0" t="0" r="0" b="0"/>
+                <wp:wrapSquare wrapText="bothSides"/>
+                <wp:docPr id="3" name="Textfeld 2"/>
+                <wp:cNvGraphicFramePr>
+                  <a:graphicFrameLocks xmlns:a="http://schemas.openxmlformats.org/drawingml/2006/main"/>
+                </wp:cNvGraphicFramePr>
+                <a:graphic xmlns:a="http://schemas.openxmlformats.org/drawingml/2006/main">
+                  <a:graphicData uri="http://schemas.microsoft.com/office/word/2010/wordprocessingShape">
+                    <wps:wsp>
+                      <wps:cNvSpPr txBox="1">
+                        <a:spLocks noChangeArrowheads="1"/>
+                      </wps:cNvSpPr>
+                      <wps:spPr bwMode="auto">
+                        <a:xfrm>
+                          <a:off x="0" y="0"/>
+                          <a:ext cx="3616325" cy="1283970"/>
+                        </a:xfrm>
+                        <a:prstGeom prst="rect">
+                          <a:avLst/>
+                        </a:prstGeom>
+                        <a:noFill/>
+                        <a:ln w="9525">
+                          <a:noFill/>
+                          <a:miter lim="800000"/>
+                          <a:headEnd/>
+                          <a:tailEnd/>
+                        </a:ln>
+                      </wps:spPr>
+                      <wps:txbx>
+                        <w:txbxContent>
+                          <w:p>
+                            <w:pPr>
+                              <w:rPr>
+                                <w:sz w:val="28"/>
+                              </w:rPr>
+                            </w:pPr>
+                            <w:r>
+                              <w:rPr>
+                                <w:rFonts w:ascii="Good Timing Rg" w:hAnsi="Good Timing Rg"/>
+                                <w:b/>
+                                <w:color w:val="262626" w:themeColor="text1" w:themeTint="D9"/>
+                                <w:sz w:val="160"/>
+                                <w:szCs w:val="112"/>
+                                <w14:shadow w14:blurRad="50800" w14:dist="50800" w14:dir="5400000" w14:sx="100000" w14:sy="100000" w14:kx="0" w14:ky="0" w14:algn="ctr">
+                                  <w14:srgbClr w14:val="FF0000"/>
+                                </w14:shadow>
+                                <w14:textOutline w14:w="6731" w14:cap="flat" w14:cmpd="sng" w14:algn="ctr">
+                                  <w14:solidFill>
+                                    <w14:schemeClr w14:val="bg1"/>
+                                  </w14:solidFill>
+                                  <w14:prstDash w14:val="solid"/>
+                                  <w14:round/>
+                                </w14:textOutline>
+                              </w:rPr>
+                              <w:t>S</w:t>
+                            </w:r>
+                            <w:r>
+                              <w:rPr>
+                                <w:rFonts w:ascii="Good Timing Rg" w:hAnsi="Good Timing Rg"/>
+                                <w:b/>
+                                <w:color w:val="262626" w:themeColor="text1" w:themeTint="D9"/>
+                                <w:sz w:val="144"/>
+                                <w:szCs w:val="72"/>
+                                <w14:shadow w14:blurRad="50800" w14:dist="50800" w14:dir="5400000" w14:sx="100000" w14:sy="100000" w14:kx="0" w14:ky="0" w14:algn="ctr">
+                                  <w14:srgbClr w14:val="FF0000"/>
+                                </w14:shadow>
+                                <w14:textOutline w14:w="6731" w14:cap="flat" w14:cmpd="sng" w14:algn="ctr">
+                                  <w14:solidFill>
+                                    <w14:schemeClr w14:val="bg1"/>
+                                  </w14:solidFill>
+                                  <w14:prstDash w14:val="solid"/>
+                                  <w14:round/>
+                                </w14:textOutline>
+                              </w:rPr>
+                              <w:t>mart</w:t>
+                            </w:r>
+                          </w:p>
+                        </w:txbxContent>
+                      </wps:txbx>
+                      <wps:bodyPr rot="0" vert="horz" wrap="square" lIns="91440" tIns="45720" rIns="91440" bIns="45720" anchor="t" anchorCtr="0">
+                        <a:noAutofit/>
+                      </wps:bodyPr>
+                    </wps:wsp>
+                  </a:graphicData>
+                </a:graphic>
+                <wp14:sizeRelH relativeFrom="margin">
+                  <wp14:pctWidth>0</wp14:pctWidth>
+                </wp14:sizeRelH>
+                <wp14:sizeRelV relativeFrom="margin">
+                  <wp14:pctHeight>0</wp14:pctHeight>
+                </wp14:sizeRelV>
+              </wp:anchor>
+            </w:drawing>
+          </mc:Choice>
+          <mc:Fallback>
+            <w:pict>
+              <v:shapetype id="_x0000_t202" coordsize="21600,21600" o:spt="202" path="m,l,21600r21600,l21600,xe">
+                <v:stroke joinstyle="miter"/>
+                <v:path gradientshapeok="t" o:connecttype="rect"/>
+              </v:shapetype>
+              <v:shape id="Textfeld 2" o:spid="_x0000_s1026" type="#_x0000_t202" style="position:absolute;margin-left:126.55pt;margin-top:1.15pt;width:284.75pt;height:101.1pt;z-index:251668480;visibility:visible;mso-wrap-style:square;mso-width-percent:0;mso-height-percent:0;mso-wrap-distance-left:9pt;mso-wrap-distance-top:3.6pt;mso-wrap-distance-right:9pt;mso-wrap-distance-bottom:3.6pt;mso-position-horizontal:absolute;mso-position-horizontal-relative:margin;mso-position-vertical:absolute;mso-position-vertical-relative:text;mso-width-percent:0;mso-height-percent:0;mso-width-relative:margin;mso-height-relative:margin;v-text-anchor:top" o:gfxdata="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" filled="f" stroked="f">
+                <v:textbox>
+                  <w:txbxContent>
+                    <w:p>
+                      <w:pPr>
+                        <w:rPr>
+                          <w:sz w:val="28"/>
+                        </w:rPr>
+                      </w:pPr>
+                      <w:r>
+                        <w:rPr>
+                          <w:rFonts w:ascii="Good Timing Rg" w:hAnsi="Good Timing Rg"/>
+                          <w:b/>
+                          <w:color w:val="262626" w:themeColor="text1" w:themeTint="D9"/>
+                          <w:sz w:val="160"/>
+                          <w:szCs w:val="112"/>
+                          <w14:shadow w14:blurRad="50800" w14:dist="50800" w14:dir="5400000" w14:sx="100000" w14:sy="100000" w14:kx="0" w14:ky="0" w14:algn="ctr">
+                            <w14:srgbClr w14:val="FF0000"/>
+                          </w14:shadow>
+                          <w14:textOutline w14:w="6731" w14:cap="flat" w14:cmpd="sng" w14:algn="ctr">
+                            <w14:solidFill>
+                              <w14:schemeClr w14:val="bg1"/>
+                            </w14:solidFill>
+                            <w14:prstDash w14:val="solid"/>
+                            <w14:round/>
+                          </w14:textOutline>
+                        </w:rPr>
+                        <w:t>S</w:t>
+                      </w:r>
+                      <w:r>
+                        <w:rPr>
+                          <w:rFonts w:ascii="Good Timing Rg" w:hAnsi="Good Timing Rg"/>
+                          <w:b/>
+                          <w:color w:val="262626" w:themeColor="text1" w:themeTint="D9"/>
+                          <w:sz w:val="144"/>
+                          <w:szCs w:val="72"/>
+                          <w14:shadow w14:blurRad="50800" w14:dist="50800" w14:dir="5400000" w14:sx="100000" w14:sy="100000" w14:kx="0" w14:ky="0" w14:algn="ctr">
+                            <w14:srgbClr w14:val="FF0000"/>
+                          </w14:shadow>
+                          <w14:textOutline w14:w="6731" w14:cap="flat" w14:cmpd="sng" w14:algn="ctr">
+                            <w14:solidFill>
+                              <w14:schemeClr w14:val="bg1"/>
+                            </w14:solidFill>
+                            <w14:prstDash w14:val="solid"/>
+                            <w14:round/>
+                          </w14:textOutline>
+                        </w:rPr>
+                        <w:t>mart</w:t>
+                      </w:r>
+                    </w:p>
+                  </w:txbxContent>
+                </v:textbox>
+                <w10:wrap type="square" anchorx="margin"/>
+              </v:shape>
+            </w:pict>
+          </mc:Fallback>
+        </mc:AlternateContent>
+      </w:r>
+      <w:r>
+        <w:rPr>
           <w:rFonts w:ascii="Good Timing Rg" w:hAnsi="Good Timing Rg"/>
           <w:b/>
           <w:noProof/>
@@ -43,13 +216,13 @@
               <wp:anchor distT="0" distB="0" distL="114300" distR="114300" simplePos="0" relativeHeight="251659264" behindDoc="1" locked="0" layoutInCell="1" allowOverlap="1">
                 <wp:simplePos x="0" y="0"/>
                 <wp:positionH relativeFrom="column">
-                  <wp:posOffset>1769745</wp:posOffset>
+                  <wp:posOffset>1750938</wp:posOffset>
                 </wp:positionH>
                 <wp:positionV relativeFrom="paragraph">
-                  <wp:posOffset>-187321</wp:posOffset>
+                  <wp:posOffset>14605</wp:posOffset>
                 </wp:positionV>
-                <wp:extent cx="2703931" cy="1559528"/>
-                <wp:effectExtent l="19050" t="19050" r="153670" b="22225"/>
+                <wp:extent cx="2703830" cy="2157573"/>
+                <wp:effectExtent l="19050" t="19050" r="134620" b="14605"/>
                 <wp:wrapNone/>
                 <wp:docPr id="2" name="Mond 2"/>
                 <wp:cNvGraphicFramePr/>
@@ -60,7 +233,7 @@
                       <wps:spPr>
                         <a:xfrm>
                           <a:off x="0" y="0"/>
-                          <a:ext cx="2703931" cy="1559528"/>
+                          <a:ext cx="2703830" cy="2157573"/>
                         </a:xfrm>
                         <a:prstGeom prst="moon">
                           <a:avLst/>
@@ -110,7 +283,7 @@
           </mc:Choice>
           <mc:Fallback>
             <w:pict>
-              <v:shapetype w14:anchorId="6564C760" id="_x0000_t184" coordsize="21600,21600" o:spt="184" adj="10800" path="m21600,qx,10800,21600,21600wa@0@10@6@11,21600,21600,21600,xe">
+              <v:shapetype w14:anchorId="30C9DDF6" id="_x0000_t184" coordsize="21600,21600" o:spt="184" adj="10800" path="m21600,qx,10800,21600,21600wa@0@10@6@11,21600,21600,21600,xe">
                 <v:stroke joinstyle="miter"/>
                 <v:formulas>
                   <v:f eqn="val #0"/>
@@ -136,50 +309,10 @@
                   <v:h position="#0,center" xrange="0,18900"/>
                 </v:handles>
               </v:shapetype>
-              <v:shape id="Mond 2" o:spid="_x0000_s1026" type="#_x0000_t184" style="position:absolute;margin-left:139.35pt;margin-top:-14.75pt;width:212.9pt;height:122.8pt;z-index:-251657216;visibility:visible;mso-wrap-style:square;mso-width-percent:0;mso-height-percent:0;mso-wrap-distance-left:9pt;mso-wrap-distance-top:0;mso-wrap-distance-right:9pt;mso-wrap-distance-bottom:0;mso-position-horizontal:absolute;mso-position-horizontal-relative:text;mso-position-vertical:absolute;mso-position-vertical-relative:text;mso-width-percent:0;mso-height-percent:0;mso-width-relative:margin;mso-height-relative:margin;v-text-anchor:middle" o:gfxdata="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" fillcolor="#0070c0" strokecolor="red" strokeweight="2.25pt"/>
+              <v:shape id="Mond 2" o:spid="_x0000_s1026" type="#_x0000_t184" style="position:absolute;margin-left:137.85pt;margin-top:1.15pt;width:212.9pt;height:169.9pt;z-index:-251657216;visibility:visible;mso-wrap-style:square;mso-width-percent:0;mso-height-percent:0;mso-wrap-distance-left:9pt;mso-wrap-distance-top:0;mso-wrap-distance-right:9pt;mso-wrap-distance-bottom:0;mso-position-horizontal:absolute;mso-position-horizontal-relative:text;mso-position-vertical:absolute;mso-position-vertical-relative:text;mso-width-percent:0;mso-height-percent:0;mso-width-relative:margin;mso-height-relative:margin;v-text-anchor:middle" o:gfxdata="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" fillcolor="#0070c0" strokecolor="red" strokeweight="2.25pt"/>
             </w:pict>
           </mc:Fallback>
         </mc:AlternateContent>
-      </w:r>
-      <w:r>
-        <w:rPr>
-          <w:rFonts w:ascii="Good Timing Rg" w:hAnsi="Good Timing Rg"/>
-          <w:b/>
-          <w:color w:val="262626" w:themeColor="text1" w:themeTint="D9"/>
-          <w:sz w:val="112"/>
-          <w:szCs w:val="112"/>
-          <w14:shadow w14:blurRad="50800" w14:dist="50800" w14:dir="5400000" w14:sx="100000" w14:sy="100000" w14:kx="0" w14:ky="0" w14:algn="ctr">
-            <w14:srgbClr w14:val="FF0000"/>
-          </w14:shadow>
-          <w14:textOutline w14:w="6731" w14:cap="flat" w14:cmpd="sng" w14:algn="ctr">
-            <w14:solidFill>
-              <w14:schemeClr w14:val="bg1"/>
-            </w14:solidFill>
-            <w14:prstDash w14:val="solid"/>
-            <w14:round/>
-          </w14:textOutline>
-        </w:rPr>
-        <w:t>S</w:t>
-      </w:r>
-      <w:r>
-        <w:rPr>
-          <w:rFonts w:ascii="Good Timing Rg" w:hAnsi="Good Timing Rg"/>
-          <w:b/>
-          <w:color w:val="262626" w:themeColor="text1" w:themeTint="D9"/>
-          <w:sz w:val="72"/>
-          <w:szCs w:val="72"/>
-          <w14:shadow w14:blurRad="50800" w14:dist="50800" w14:dir="5400000" w14:sx="100000" w14:sy="100000" w14:kx="0" w14:ky="0" w14:algn="ctr">
-            <w14:srgbClr w14:val="FF0000"/>
-          </w14:shadow>
-          <w14:textOutline w14:w="6731" w14:cap="flat" w14:cmpd="sng" w14:algn="ctr">
-            <w14:solidFill>
-              <w14:schemeClr w14:val="bg1"/>
-            </w14:solidFill>
-            <w14:prstDash w14:val="solid"/>
-            <w14:round/>
-          </w14:textOutline>
-        </w:rPr>
-        <w:t>mart</w:t>
       </w:r>
       <w:r>
         <w:rPr>
@@ -221,51 +354,192 @@
         </w:rPr>
         <w:t xml:space="preserve">   </w:t>
       </w:r>
+    </w:p>
+    <w:p>
       <w:r>
         <w:rPr>
-          <w:rFonts w:ascii="Good Timing Rg" w:hAnsi="Good Timing Rg"/>
-          <w:b/>
-          <w:color w:val="262626" w:themeColor="text1" w:themeTint="D9"/>
-          <w:sz w:val="112"/>
-          <w:szCs w:val="112"/>
-          <w14:shadow w14:blurRad="50800" w14:dist="50800" w14:dir="5400000" w14:sx="100000" w14:sy="100000" w14:kx="0" w14:ky="0" w14:algn="ctr">
-            <w14:srgbClr w14:val="FF0000"/>
-          </w14:shadow>
-          <w14:textOutline w14:w="6731" w14:cap="flat" w14:cmpd="sng" w14:algn="ctr">
-            <w14:solidFill>
-              <w14:schemeClr w14:val="bg1"/>
-            </w14:solidFill>
-            <w14:prstDash w14:val="solid"/>
-            <w14:round/>
-          </w14:textOutline>
+          <w:noProof/>
         </w:rPr>
-        <w:t>T</w:t>
-      </w:r>
-      <w:r>
-        <w:rPr>
-          <w:rFonts w:ascii="Good Timing Rg" w:hAnsi="Good Timing Rg"/>
-          <w:b/>
-          <w:color w:val="262626" w:themeColor="text1" w:themeTint="D9"/>
-          <w:sz w:val="72"/>
-          <w:szCs w:val="72"/>
-          <w14:shadow w14:blurRad="50800" w14:dist="50800" w14:dir="5400000" w14:sx="100000" w14:sy="100000" w14:kx="0" w14:ky="0" w14:algn="ctr">
-            <w14:srgbClr w14:val="FF0000"/>
-          </w14:shadow>
-          <w14:textOutline w14:w="6731" w14:cap="flat" w14:cmpd="sng" w14:algn="ctr">
-            <w14:solidFill>
-              <w14:schemeClr w14:val="bg1"/>
-            </w14:solidFill>
-            <w14:prstDash w14:val="solid"/>
-            <w14:round/>
-          </w14:textOutline>
-        </w:rPr>
-        <w:t>iming</w:t>
+        <mc:AlternateContent>
+          <mc:Choice Requires="wps">
+            <w:drawing>
+              <wp:anchor distT="45720" distB="45720" distL="114300" distR="114300" simplePos="0" relativeHeight="251670528" behindDoc="0" locked="0" layoutInCell="1" allowOverlap="1">
+                <wp:simplePos x="0" y="0"/>
+                <wp:positionH relativeFrom="column">
+                  <wp:posOffset>1987207</wp:posOffset>
+                </wp:positionH>
+                <wp:positionV relativeFrom="paragraph">
+                  <wp:posOffset>150053</wp:posOffset>
+                </wp:positionV>
+                <wp:extent cx="3513455" cy="1404620"/>
+                <wp:effectExtent l="0" t="0" r="0" b="2540"/>
+                <wp:wrapSquare wrapText="bothSides"/>
+                <wp:docPr id="6" name="Textfeld 2"/>
+                <wp:cNvGraphicFramePr>
+                  <a:graphicFrameLocks xmlns:a="http://schemas.openxmlformats.org/drawingml/2006/main"/>
+                </wp:cNvGraphicFramePr>
+                <a:graphic xmlns:a="http://schemas.openxmlformats.org/drawingml/2006/main">
+                  <a:graphicData uri="http://schemas.microsoft.com/office/word/2010/wordprocessingShape">
+                    <wps:wsp>
+                      <wps:cNvSpPr txBox="1">
+                        <a:spLocks noChangeArrowheads="1"/>
+                      </wps:cNvSpPr>
+                      <wps:spPr bwMode="auto">
+                        <a:xfrm>
+                          <a:off x="0" y="0"/>
+                          <a:ext cx="3513455" cy="1404620"/>
+                        </a:xfrm>
+                        <a:prstGeom prst="rect">
+                          <a:avLst/>
+                        </a:prstGeom>
+                        <a:noFill/>
+                        <a:ln w="9525">
+                          <a:noFill/>
+                          <a:miter lim="800000"/>
+                          <a:headEnd/>
+                          <a:tailEnd/>
+                        </a:ln>
+                      </wps:spPr>
+                      <wps:txbx>
+                        <w:txbxContent>
+                          <w:p>
+                            <w:pPr>
+                              <w:rPr>
+                                <w:sz w:val="28"/>
+                              </w:rPr>
+                            </w:pPr>
+                            <w:r>
+                              <w:rPr>
+                                <w:rFonts w:ascii="Good Timing Rg" w:hAnsi="Good Timing Rg"/>
+                                <w:b/>
+                                <w:color w:val="262626" w:themeColor="text1" w:themeTint="D9"/>
+                                <w:sz w:val="160"/>
+                                <w:szCs w:val="112"/>
+                                <w14:shadow w14:blurRad="50800" w14:dist="50800" w14:dir="5400000" w14:sx="100000" w14:sy="100000" w14:kx="0" w14:ky="0" w14:algn="ctr">
+                                  <w14:srgbClr w14:val="FF0000"/>
+                                </w14:shadow>
+                                <w14:textOutline w14:w="6731" w14:cap="flat" w14:cmpd="sng" w14:algn="ctr">
+                                  <w14:solidFill>
+                                    <w14:schemeClr w14:val="bg1"/>
+                                  </w14:solidFill>
+                                  <w14:prstDash w14:val="solid"/>
+                                  <w14:round/>
+                                </w14:textOutline>
+                              </w:rPr>
+                              <w:t>T</w:t>
+                            </w:r>
+                            <w:r>
+                              <w:rPr>
+                                <w:rFonts w:ascii="Good Timing Rg" w:hAnsi="Good Timing Rg"/>
+                                <w:b/>
+                                <w:color w:val="262626" w:themeColor="text1" w:themeTint="D9"/>
+                                <w:sz w:val="144"/>
+                                <w:szCs w:val="72"/>
+                                <w14:shadow w14:blurRad="50800" w14:dist="50800" w14:dir="5400000" w14:sx="100000" w14:sy="100000" w14:kx="0" w14:ky="0" w14:algn="ctr">
+                                  <w14:srgbClr w14:val="FF0000"/>
+                                </w14:shadow>
+                                <w14:textOutline w14:w="6731" w14:cap="flat" w14:cmpd="sng" w14:algn="ctr">
+                                  <w14:solidFill>
+                                    <w14:schemeClr w14:val="bg1"/>
+                                  </w14:solidFill>
+                                  <w14:prstDash w14:val="solid"/>
+                                  <w14:round/>
+                                </w14:textOutline>
+                              </w:rPr>
+                              <w:t>iming</w:t>
+                            </w:r>
+                          </w:p>
+                        </w:txbxContent>
+                      </wps:txbx>
+                      <wps:bodyPr rot="0" vert="horz" wrap="square" lIns="91440" tIns="45720" rIns="91440" bIns="45720" anchor="t" anchorCtr="0">
+                        <a:spAutoFit/>
+                      </wps:bodyPr>
+                    </wps:wsp>
+                  </a:graphicData>
+                </a:graphic>
+                <wp14:sizeRelH relativeFrom="margin">
+                  <wp14:pctWidth>0</wp14:pctWidth>
+                </wp14:sizeRelH>
+                <wp14:sizeRelV relativeFrom="margin">
+                  <wp14:pctHeight>20000</wp14:pctHeight>
+                </wp14:sizeRelV>
+              </wp:anchor>
+            </w:drawing>
+          </mc:Choice>
+          <mc:Fallback>
+            <w:pict>
+              <v:shape id="_x0000_s1027" type="#_x0000_t202" style="position:absolute;margin-left:156.45pt;margin-top:11.8pt;width:276.65pt;height:110.6pt;z-index:251670528;visibility:visible;mso-wrap-style:square;mso-width-percent:0;mso-height-percent:200;mso-wrap-distance-left:9pt;mso-wrap-distance-top:3.6pt;mso-wrap-distance-right:9pt;mso-wrap-distance-bottom:3.6pt;mso-position-horizontal:absolute;mso-position-horizontal-relative:text;mso-position-vertical:absolute;mso-position-vertical-relative:text;mso-width-percent:0;mso-height-percent:200;mso-width-relative:margin;mso-height-relative:margin;v-text-anchor:top" o:gfxdata="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" filled="f" stroked="f">
+                <v:textbox style="mso-fit-shape-to-text:t">
+                  <w:txbxContent>
+                    <w:p>
+                      <w:pPr>
+                        <w:rPr>
+                          <w:sz w:val="28"/>
+                        </w:rPr>
+                      </w:pPr>
+                      <w:r>
+                        <w:rPr>
+                          <w:rFonts w:ascii="Good Timing Rg" w:hAnsi="Good Timing Rg"/>
+                          <w:b/>
+                          <w:color w:val="262626" w:themeColor="text1" w:themeTint="D9"/>
+                          <w:sz w:val="160"/>
+                          <w:szCs w:val="112"/>
+                          <w14:shadow w14:blurRad="50800" w14:dist="50800" w14:dir="5400000" w14:sx="100000" w14:sy="100000" w14:kx="0" w14:ky="0" w14:algn="ctr">
+                            <w14:srgbClr w14:val="FF0000"/>
+                          </w14:shadow>
+                          <w14:textOutline w14:w="6731" w14:cap="flat" w14:cmpd="sng" w14:algn="ctr">
+                            <w14:solidFill>
+                              <w14:schemeClr w14:val="bg1"/>
+                            </w14:solidFill>
+                            <w14:prstDash w14:val="solid"/>
+                            <w14:round/>
+                          </w14:textOutline>
+                        </w:rPr>
+                        <w:t>T</w:t>
+                      </w:r>
+                      <w:r>
+                        <w:rPr>
+                          <w:rFonts w:ascii="Good Timing Rg" w:hAnsi="Good Timing Rg"/>
+                          <w:b/>
+                          <w:color w:val="262626" w:themeColor="text1" w:themeTint="D9"/>
+                          <w:sz w:val="144"/>
+                          <w:szCs w:val="72"/>
+                          <w14:shadow w14:blurRad="50800" w14:dist="50800" w14:dir="5400000" w14:sx="100000" w14:sy="100000" w14:kx="0" w14:ky="0" w14:algn="ctr">
+                            <w14:srgbClr w14:val="FF0000"/>
+                          </w14:shadow>
+                          <w14:textOutline w14:w="6731" w14:cap="flat" w14:cmpd="sng" w14:algn="ctr">
+                            <w14:solidFill>
+                              <w14:schemeClr w14:val="bg1"/>
+                            </w14:solidFill>
+                            <w14:prstDash w14:val="solid"/>
+                            <w14:round/>
+                          </w14:textOutline>
+                        </w:rPr>
+                        <w:t>iming</w:t>
+                      </w:r>
+                    </w:p>
+                  </w:txbxContent>
+                </v:textbox>
+                <w10:wrap type="square"/>
+              </v:shape>
+            </w:pict>
+          </mc:Fallback>
+        </mc:AlternateContent>
       </w:r>
     </w:p>
     <w:p/>
     <w:p/>
+    <w:p/>
+    <w:p/>
+    <w:p/>
+    <w:p/>
+    <w:p/>
+    <w:p/>
     <w:p>
       <w:bookmarkStart w:id="0" w:name="_GoBack"/>
+      <w:bookmarkEnd w:id="0"/>
+    </w:p>
+    <w:p>
       <w:r>
         <w:rPr>
           <w:noProof/>
@@ -539,7 +813,6 @@
           </mc:Fallback>
         </mc:AlternateContent>
       </w:r>
-      <w:bookmarkEnd w:id="0"/>
     </w:p>
     <w:p>
       <w:pPr>
@@ -567,6 +840,7 @@
     <w:p>
       <w:pPr>
         <w:rPr>
+          <w:color w:val="000000"/>
           <w14:textFill>
             <w14:solidFill>
               <w14:srgbClr w14:val="000000">
@@ -581,6 +855,7 @@
       <w:r>
         <w:rPr>
           <w:noProof/>
+          <w:lang w:eastAsia="de-DE"/>
         </w:rPr>
         <mc:AlternateContent>
           <mc:Choice Requires="wps">

</xml_diff>